<commit_message>
Add generic diagram preservation and 12 register boxes
</commit_message>
<xml_diff>
--- a/samples/AI (2).docx
+++ b/samples/AI (2).docx
@@ -139,6 +139,7 @@
                 <w:szCs w:val="20"/>
               </w:rPr>
             </w:pPr>
+            <w:proofErr w:type="spellStart"/>
             <w:r>
               <w:rPr>
                 <w:rFonts w:ascii="Times New Roman" w:hAnsi="Times New Roman" w:cs="Times New Roman"/>
@@ -148,6 +149,7 @@
               </w:rPr>
               <w:t>Kunnam</w:t>
             </w:r>
+            <w:proofErr w:type="spellEnd"/>
             <w:r>
               <w:rPr>
                 <w:rFonts w:ascii="Times New Roman" w:hAnsi="Times New Roman" w:cs="Times New Roman"/>
@@ -157,6 +159,7 @@
               </w:rPr>
               <w:t xml:space="preserve">, </w:t>
             </w:r>
+            <w:proofErr w:type="spellStart"/>
             <w:r>
               <w:rPr>
                 <w:rFonts w:ascii="Times New Roman" w:hAnsi="Times New Roman" w:cs="Times New Roman"/>
@@ -164,7 +167,17 @@
                 <w:sz w:val="20"/>
                 <w:szCs w:val="20"/>
               </w:rPr>
-              <w:t>Sanguvarchatram, Sriperumbudur</w:t>
+              <w:t>Sanguvarchatram</w:t>
+            </w:r>
+            <w:proofErr w:type="spellEnd"/>
+            <w:r>
+              <w:rPr>
+                <w:rFonts w:ascii="Times New Roman" w:hAnsi="Times New Roman" w:cs="Times New Roman"/>
+                <w:b/>
+                <w:sz w:val="20"/>
+                <w:szCs w:val="20"/>
+              </w:rPr>
+              <w:t>, Sriperumbudur</w:t>
             </w:r>
             <w:r>
               <w:rPr>
@@ -443,6 +456,7 @@
                 <w:szCs w:val="24"/>
               </w:rPr>
             </w:pPr>
+            <w:proofErr w:type="gramStart"/>
             <w:r>
               <w:rPr>
                 <w:rFonts w:ascii="Times New Roman" w:hAnsi="Times New Roman" w:cs="Times New Roman"/>
@@ -467,6 +481,7 @@
               </w:rPr>
               <w:t>IT</w:t>
             </w:r>
+            <w:proofErr w:type="gramEnd"/>
             <w:r>
               <w:rPr>
                 <w:rFonts w:ascii="Times New Roman" w:hAnsi="Times New Roman" w:cs="Times New Roman"/>
@@ -1837,13 +1852,23 @@
                 <w:szCs w:val="24"/>
               </w:rPr>
             </w:pPr>
-            <w:r>
-              <w:rPr>
-                <w:rFonts w:ascii="Times New Roman" w:hAnsi="Times New Roman" w:cs="Times New Roman"/>
-                <w:sz w:val="24"/>
-                <w:szCs w:val="24"/>
-              </w:rPr>
-              <w:t>Qp. No.</w:t>
+            <w:proofErr w:type="spellStart"/>
+            <w:r>
+              <w:rPr>
+                <w:rFonts w:ascii="Times New Roman" w:hAnsi="Times New Roman" w:cs="Times New Roman"/>
+                <w:sz w:val="24"/>
+                <w:szCs w:val="24"/>
+              </w:rPr>
+              <w:t>Qp</w:t>
+            </w:r>
+            <w:proofErr w:type="spellEnd"/>
+            <w:r>
+              <w:rPr>
+                <w:rFonts w:ascii="Times New Roman" w:hAnsi="Times New Roman" w:cs="Times New Roman"/>
+                <w:sz w:val="24"/>
+                <w:szCs w:val="24"/>
+              </w:rPr>
+              <w:t>. No.</w:t>
             </w:r>
           </w:p>
         </w:tc>
@@ -1860,13 +1885,23 @@
                 <w:szCs w:val="16"/>
               </w:rPr>
             </w:pPr>
+            <w:proofErr w:type="spellStart"/>
             <w:r>
               <w:rPr>
                 <w:rFonts w:ascii="Times New Roman" w:hAnsi="Times New Roman" w:cs="Times New Roman"/>
                 <w:sz w:val="16"/>
                 <w:szCs w:val="16"/>
               </w:rPr>
-              <w:t>Qp. COU</w:t>
+              <w:t>Qp</w:t>
+            </w:r>
+            <w:proofErr w:type="spellEnd"/>
+            <w:r>
+              <w:rPr>
+                <w:rFonts w:ascii="Times New Roman" w:hAnsi="Times New Roman" w:cs="Times New Roman"/>
+                <w:sz w:val="16"/>
+                <w:szCs w:val="16"/>
+              </w:rPr>
+              <w:t>. COU</w:t>
             </w:r>
           </w:p>
           <w:p>
@@ -6507,7 +6542,27 @@
                 <w:sz w:val="24"/>
                 <w:szCs w:val="24"/>
               </w:rPr>
-              <w:t>Write about CSP with graph coloring problem.</w:t>
+              <w:t xml:space="preserve">Write about CSP with graph </w:t>
+            </w:r>
+            <w:proofErr w:type="spellStart"/>
+            <w:r>
+              <w:rPr>
+                <w:rFonts w:ascii="Times New Roman" w:hAnsi="Times New Roman" w:cs="Times New Roman"/>
+                <w:color w:val="000000" w:themeColor="text1"/>
+                <w:sz w:val="24"/>
+                <w:szCs w:val="24"/>
+              </w:rPr>
+              <w:t>coloring</w:t>
+            </w:r>
+            <w:proofErr w:type="spellEnd"/>
+            <w:r>
+              <w:rPr>
+                <w:rFonts w:ascii="Times New Roman" w:hAnsi="Times New Roman" w:cs="Times New Roman"/>
+                <w:color w:val="000000" w:themeColor="text1"/>
+                <w:sz w:val="24"/>
+                <w:szCs w:val="24"/>
+              </w:rPr>
+              <w:t xml:space="preserve"> problem.</w:t>
             </w:r>
           </w:p>
         </w:tc>
@@ -6790,7 +6845,29 @@
                 <w:szCs w:val="24"/>
                 <w:lang w:val="en-US"/>
               </w:rPr>
-              <w:t>Define monte-carlo search.</w:t>
+              <w:t>Define monte-</w:t>
+            </w:r>
+            <w:proofErr w:type="spellStart"/>
+            <w:r>
+              <w:rPr>
+                <w:rFonts w:ascii="Times New Roman" w:hAnsi="Times New Roman" w:cs="Times New Roman"/>
+                <w:color w:val="000000" w:themeColor="text1"/>
+                <w:sz w:val="24"/>
+                <w:szCs w:val="24"/>
+                <w:lang w:val="en-US"/>
+              </w:rPr>
+              <w:t>carlo</w:t>
+            </w:r>
+            <w:proofErr w:type="spellEnd"/>
+            <w:r>
+              <w:rPr>
+                <w:rFonts w:ascii="Times New Roman" w:hAnsi="Times New Roman" w:cs="Times New Roman"/>
+                <w:color w:val="000000" w:themeColor="text1"/>
+                <w:sz w:val="24"/>
+                <w:szCs w:val="24"/>
+                <w:lang w:val="en-US"/>
+              </w:rPr>
+              <w:t xml:space="preserve"> search.</w:t>
             </w:r>
           </w:p>
         </w:tc>
@@ -6931,7 +7008,29 @@
                 <w:szCs w:val="24"/>
                 <w:lang w:val="en-US"/>
               </w:rPr>
-              <w:t>What is the use of monte-carlo search?</w:t>
+              <w:t>What is the use of monte-</w:t>
+            </w:r>
+            <w:proofErr w:type="spellStart"/>
+            <w:r>
+              <w:rPr>
+                <w:rFonts w:ascii="Times New Roman" w:hAnsi="Times New Roman" w:cs="Times New Roman"/>
+                <w:color w:val="000000" w:themeColor="text1"/>
+                <w:sz w:val="24"/>
+                <w:szCs w:val="24"/>
+                <w:lang w:val="en-US"/>
+              </w:rPr>
+              <w:t>carlo</w:t>
+            </w:r>
+            <w:proofErr w:type="spellEnd"/>
+            <w:r>
+              <w:rPr>
+                <w:rFonts w:ascii="Times New Roman" w:hAnsi="Times New Roman" w:cs="Times New Roman"/>
+                <w:color w:val="000000" w:themeColor="text1"/>
+                <w:sz w:val="24"/>
+                <w:szCs w:val="24"/>
+                <w:lang w:val="en-US"/>
+              </w:rPr>
+              <w:t xml:space="preserve"> search?</w:t>
             </w:r>
           </w:p>
         </w:tc>
@@ -7072,7 +7171,29 @@
                 <w:szCs w:val="24"/>
                 <w:lang w:val="en-US"/>
               </w:rPr>
-              <w:t>What are the advantages and disadvantages of monte-carlo search?</w:t>
+              <w:t>What are the advantages and disadvantages of monte-</w:t>
+            </w:r>
+            <w:proofErr w:type="spellStart"/>
+            <w:r>
+              <w:rPr>
+                <w:rFonts w:ascii="Times New Roman" w:hAnsi="Times New Roman" w:cs="Times New Roman"/>
+                <w:color w:val="000000" w:themeColor="text1"/>
+                <w:sz w:val="24"/>
+                <w:szCs w:val="24"/>
+                <w:lang w:val="en-US"/>
+              </w:rPr>
+              <w:t>carlo</w:t>
+            </w:r>
+            <w:proofErr w:type="spellEnd"/>
+            <w:r>
+              <w:rPr>
+                <w:rFonts w:ascii="Times New Roman" w:hAnsi="Times New Roman" w:cs="Times New Roman"/>
+                <w:color w:val="000000" w:themeColor="text1"/>
+                <w:sz w:val="24"/>
+                <w:szCs w:val="24"/>
+                <w:lang w:val="en-US"/>
+              </w:rPr>
+              <w:t xml:space="preserve"> search?</w:t>
             </w:r>
           </w:p>
         </w:tc>
@@ -7496,6 +7617,7 @@
               </w:rPr>
               <w:t>Define F</w:t>
             </w:r>
+            <w:proofErr w:type="spellStart"/>
             <w:r>
               <w:rPr>
                 <w:rFonts w:ascii="Times New Roman" w:hAnsi="Times New Roman" w:cs="Times New Roman"/>
@@ -7504,7 +7626,18 @@
                 <w:sz w:val="24"/>
                 <w:lang w:val="en-US"/>
               </w:rPr>
-              <w:t>irst Order Logic.</w:t>
+              <w:t>irst</w:t>
+            </w:r>
+            <w:proofErr w:type="spellEnd"/>
+            <w:r>
+              <w:rPr>
+                <w:rFonts w:ascii="Times New Roman" w:hAnsi="Times New Roman" w:cs="Times New Roman"/>
+                <w:bCs/>
+                <w:color w:val="000000"/>
+                <w:sz w:val="24"/>
+                <w:lang w:val="en-US"/>
+              </w:rPr>
+              <w:t xml:space="preserve"> Order Logic.</w:t>
             </w:r>
           </w:p>
         </w:tc>
@@ -8295,7 +8428,29 @@
                 <w:szCs w:val="24"/>
                 <w:lang w:val="en-US"/>
               </w:rPr>
-              <w:t>Compare the differences between propositional logic an first order logic</w:t>
+              <w:t xml:space="preserve">Compare the differences between propositional logic </w:t>
+            </w:r>
+            <w:proofErr w:type="gramStart"/>
+            <w:r>
+              <w:rPr>
+                <w:rFonts w:ascii="Times New Roman" w:hAnsi="Times New Roman" w:cs="Times New Roman"/>
+                <w:color w:val="000000" w:themeColor="text1"/>
+                <w:sz w:val="24"/>
+                <w:szCs w:val="24"/>
+                <w:lang w:val="en-US"/>
+              </w:rPr>
+              <w:t>an</w:t>
+            </w:r>
+            <w:proofErr w:type="gramEnd"/>
+            <w:r>
+              <w:rPr>
+                <w:rFonts w:ascii="Times New Roman" w:hAnsi="Times New Roman" w:cs="Times New Roman"/>
+                <w:color w:val="000000" w:themeColor="text1"/>
+                <w:sz w:val="24"/>
+                <w:szCs w:val="24"/>
+                <w:lang w:val="en-US"/>
+              </w:rPr>
+              <w:t xml:space="preserve"> first order logic</w:t>
             </w:r>
           </w:p>
         </w:tc>
@@ -11856,7 +12011,29 @@
                 <w:szCs w:val="24"/>
                 <w:lang w:val="en-US" w:eastAsia="en-US"/>
               </w:rPr>
-              <w:t>What is sensorless planning?</w:t>
+              <w:t xml:space="preserve">What is </w:t>
+            </w:r>
+            <w:proofErr w:type="spellStart"/>
+            <w:r>
+              <w:rPr>
+                <w:rFonts w:ascii="Times New Roman" w:eastAsia="Calibri" w:hAnsi="Times New Roman" w:cs="Times New Roman"/>
+                <w:color w:val="000000" w:themeColor="text1"/>
+                <w:sz w:val="24"/>
+                <w:szCs w:val="24"/>
+                <w:lang w:val="en-US" w:eastAsia="en-US"/>
+              </w:rPr>
+              <w:t>sensorless</w:t>
+            </w:r>
+            <w:proofErr w:type="spellEnd"/>
+            <w:r>
+              <w:rPr>
+                <w:rFonts w:ascii="Times New Roman" w:eastAsia="Calibri" w:hAnsi="Times New Roman" w:cs="Times New Roman"/>
+                <w:color w:val="000000" w:themeColor="text1"/>
+                <w:sz w:val="24"/>
+                <w:szCs w:val="24"/>
+                <w:lang w:val="en-US" w:eastAsia="en-US"/>
+              </w:rPr>
+              <w:t xml:space="preserve"> planning?</w:t>
             </w:r>
           </w:p>
         </w:tc>
@@ -12102,7 +12279,29 @@
                 <w:szCs w:val="24"/>
                 <w:lang w:val="en-US" w:eastAsia="en-US"/>
               </w:rPr>
-              <w:t>Define execution monitoring an replanning.</w:t>
+              <w:t xml:space="preserve">Define execution monitoring </w:t>
+            </w:r>
+            <w:proofErr w:type="gramStart"/>
+            <w:r>
+              <w:rPr>
+                <w:rFonts w:ascii="Times New Roman" w:eastAsia="Calibri" w:hAnsi="Times New Roman" w:cs="Times New Roman"/>
+                <w:color w:val="000000" w:themeColor="text1"/>
+                <w:sz w:val="24"/>
+                <w:szCs w:val="24"/>
+                <w:lang w:val="en-US" w:eastAsia="en-US"/>
+              </w:rPr>
+              <w:t>an</w:t>
+            </w:r>
+            <w:proofErr w:type="gramEnd"/>
+            <w:r>
+              <w:rPr>
+                <w:rFonts w:ascii="Times New Roman" w:eastAsia="Calibri" w:hAnsi="Times New Roman" w:cs="Times New Roman"/>
+                <w:color w:val="000000" w:themeColor="text1"/>
+                <w:sz w:val="24"/>
+                <w:szCs w:val="24"/>
+                <w:lang w:val="en-US" w:eastAsia="en-US"/>
+              </w:rPr>
+              <w:t xml:space="preserve"> replanning.</w:t>
             </w:r>
           </w:p>
         </w:tc>
@@ -12471,7 +12670,29 @@
                 <w:szCs w:val="24"/>
                 <w:lang w:val="en-US" w:eastAsia="en-US"/>
               </w:rPr>
-              <w:t>What is STRIPS? What it is used for?</w:t>
+              <w:t xml:space="preserve">What </w:t>
+            </w:r>
+            <w:proofErr w:type="gramStart"/>
+            <w:r>
+              <w:rPr>
+                <w:rFonts w:ascii="Times New Roman" w:eastAsia="Calibri" w:hAnsi="Times New Roman" w:cs="Times New Roman"/>
+                <w:color w:val="000000" w:themeColor="text1"/>
+                <w:sz w:val="24"/>
+                <w:szCs w:val="24"/>
+                <w:lang w:val="en-US" w:eastAsia="en-US"/>
+              </w:rPr>
+              <w:t>is</w:t>
+            </w:r>
+            <w:proofErr w:type="gramEnd"/>
+            <w:r>
+              <w:rPr>
+                <w:rFonts w:ascii="Times New Roman" w:eastAsia="Calibri" w:hAnsi="Times New Roman" w:cs="Times New Roman"/>
+                <w:color w:val="000000" w:themeColor="text1"/>
+                <w:sz w:val="24"/>
+                <w:szCs w:val="24"/>
+                <w:lang w:val="en-US" w:eastAsia="en-US"/>
+              </w:rPr>
+              <w:t xml:space="preserve"> STRIPS? What it is used for?</w:t>
             </w:r>
           </w:p>
         </w:tc>
@@ -15027,7 +15248,27 @@
                 <w:sz w:val="24"/>
                 <w:u w:val="single"/>
               </w:rPr>
-              <w:t>Part – B ( 5 x 13 = 65 Marks</w:t>
+              <w:t xml:space="preserve">Part – B </w:t>
+            </w:r>
+            <w:proofErr w:type="gramStart"/>
+            <w:r>
+              <w:rPr>
+                <w:rFonts w:ascii="Times New Roman" w:hAnsi="Times New Roman"/>
+                <w:b/>
+                <w:sz w:val="24"/>
+                <w:u w:val="single"/>
+              </w:rPr>
+              <w:t>( 5</w:t>
+            </w:r>
+            <w:proofErr w:type="gramEnd"/>
+            <w:r>
+              <w:rPr>
+                <w:rFonts w:ascii="Times New Roman" w:hAnsi="Times New Roman"/>
+                <w:b/>
+                <w:sz w:val="24"/>
+                <w:u w:val="single"/>
+              </w:rPr>
+              <w:t xml:space="preserve"> x 13 = 65 Marks</w:t>
             </w:r>
             <w:r>
               <w:rPr>
@@ -15096,7 +15337,7 @@
                 <w:sz w:val="24"/>
                 <w:szCs w:val="24"/>
               </w:rPr>
-              <w:t>11.a.</w:t>
+              <w:t>11a</w:t>
             </w:r>
           </w:p>
         </w:tc>
@@ -15253,7 +15494,7 @@
                 <w:sz w:val="24"/>
                 <w:szCs w:val="24"/>
               </w:rPr>
-              <w:t>11.a.</w:t>
+              <w:t>11a</w:t>
             </w:r>
           </w:p>
         </w:tc>
@@ -15400,7 +15641,15 @@
                 <w:sz w:val="24"/>
                 <w:szCs w:val="24"/>
               </w:rPr>
-              <w:t>11.a.</w:t>
+              <w:t>11</w:t>
+            </w:r>
+            <w:r>
+              <w:rPr>
+                <w:rFonts w:ascii="Times New Roman" w:hAnsi="Times New Roman" w:cs="Times New Roman"/>
+                <w:sz w:val="24"/>
+                <w:szCs w:val="24"/>
+              </w:rPr>
+              <w:t>a</w:t>
             </w:r>
           </w:p>
         </w:tc>
@@ -15547,7 +15796,7 @@
                 <w:sz w:val="24"/>
                 <w:szCs w:val="24"/>
               </w:rPr>
-              <w:t>11.a.</w:t>
+              <w:t>11a</w:t>
             </w:r>
           </w:p>
         </w:tc>
@@ -15694,7 +15943,15 @@
                 <w:sz w:val="24"/>
                 <w:szCs w:val="24"/>
               </w:rPr>
-              <w:t>11.a.</w:t>
+              <w:t>1</w:t>
+            </w:r>
+            <w:r>
+              <w:rPr>
+                <w:rFonts w:ascii="Times New Roman" w:hAnsi="Times New Roman" w:cs="Times New Roman"/>
+                <w:sz w:val="24"/>
+                <w:szCs w:val="24"/>
+              </w:rPr>
+              <w:t>1a</w:t>
             </w:r>
           </w:p>
         </w:tc>
@@ -15841,7 +16098,7 @@
                 <w:sz w:val="24"/>
                 <w:szCs w:val="24"/>
               </w:rPr>
-              <w:t>11.a.</w:t>
+              <w:t>11a</w:t>
             </w:r>
           </w:p>
         </w:tc>
@@ -16056,7 +16313,7 @@
                 <w:sz w:val="24"/>
                 <w:szCs w:val="24"/>
               </w:rPr>
-              <w:t>11.a.</w:t>
+              <w:t>11a</w:t>
             </w:r>
           </w:p>
         </w:tc>
@@ -16203,7 +16460,7 @@
                 <w:sz w:val="24"/>
                 <w:szCs w:val="24"/>
               </w:rPr>
-              <w:t>11.a.</w:t>
+              <w:t>11a</w:t>
             </w:r>
           </w:p>
         </w:tc>
@@ -16340,7 +16597,7 @@
                 <w:szCs w:val="24"/>
               </w:rPr>
               <w:lastRenderedPageBreak/>
-              <w:t>11.a.</w:t>
+              <w:t>11a</w:t>
             </w:r>
           </w:p>
         </w:tc>
@@ -16487,7 +16744,7 @@
                 <w:sz w:val="24"/>
                 <w:szCs w:val="24"/>
               </w:rPr>
-              <w:t>11.a.</w:t>
+              <w:t>11a</w:t>
             </w:r>
           </w:p>
         </w:tc>
@@ -16634,7 +16891,7 @@
                 <w:sz w:val="24"/>
                 <w:szCs w:val="24"/>
               </w:rPr>
-              <w:t>11.b.</w:t>
+              <w:t>11b</w:t>
             </w:r>
           </w:p>
         </w:tc>
@@ -16768,7 +17025,7 @@
                 <w:sz w:val="24"/>
                 <w:szCs w:val="24"/>
               </w:rPr>
-              <w:t>11.b.</w:t>
+              <w:t>11b</w:t>
             </w:r>
           </w:p>
         </w:tc>
@@ -16914,7 +17171,7 @@
                 <w:sz w:val="24"/>
                 <w:szCs w:val="24"/>
               </w:rPr>
-              <w:t>11.b.</w:t>
+              <w:t>11b</w:t>
             </w:r>
           </w:p>
         </w:tc>
@@ -17042,7 +17299,7 @@
                 <w:sz w:val="24"/>
                 <w:szCs w:val="24"/>
               </w:rPr>
-              <w:t>11.b.</w:t>
+              <w:t>11b</w:t>
             </w:r>
           </w:p>
         </w:tc>
@@ -17189,7 +17446,7 @@
                 <w:sz w:val="24"/>
                 <w:szCs w:val="24"/>
               </w:rPr>
-              <w:t>11.b.</w:t>
+              <w:t>11b</w:t>
             </w:r>
           </w:p>
         </w:tc>
@@ -17336,7 +17593,7 @@
                 <w:sz w:val="24"/>
                 <w:szCs w:val="24"/>
               </w:rPr>
-              <w:t>11.b.</w:t>
+              <w:t>11b</w:t>
             </w:r>
           </w:p>
         </w:tc>
@@ -17483,7 +17740,7 @@
                 <w:sz w:val="24"/>
                 <w:szCs w:val="24"/>
               </w:rPr>
-              <w:t>11.b.</w:t>
+              <w:t>11b</w:t>
             </w:r>
           </w:p>
         </w:tc>
@@ -17629,7 +17886,7 @@
                 <w:sz w:val="24"/>
                 <w:szCs w:val="24"/>
               </w:rPr>
-              <w:t>11.b.</w:t>
+              <w:t>11b</w:t>
             </w:r>
           </w:p>
         </w:tc>
@@ -17754,7 +18011,7 @@
                 <w:sz w:val="24"/>
                 <w:szCs w:val="24"/>
               </w:rPr>
-              <w:t>11.b.</w:t>
+              <w:t>11b</w:t>
             </w:r>
           </w:p>
         </w:tc>
@@ -17891,7 +18148,7 @@
                 <w:sz w:val="24"/>
                 <w:szCs w:val="24"/>
               </w:rPr>
-              <w:t>11.b.</w:t>
+              <w:t>11b</w:t>
             </w:r>
           </w:p>
         </w:tc>
@@ -18036,7 +18293,7 @@
                 <w:sz w:val="24"/>
                 <w:szCs w:val="24"/>
               </w:rPr>
-              <w:t>12.a.</w:t>
+              <w:t>12a</w:t>
             </w:r>
           </w:p>
         </w:tc>
@@ -18184,7 +18441,7 @@
                 <w:sz w:val="24"/>
                 <w:szCs w:val="24"/>
               </w:rPr>
-              <w:t>12.a.</w:t>
+              <w:t>12a</w:t>
             </w:r>
           </w:p>
         </w:tc>
@@ -18310,7 +18567,7 @@
                 <w:sz w:val="24"/>
                 <w:szCs w:val="24"/>
               </w:rPr>
-              <w:t>12.a.</w:t>
+              <w:t>12a</w:t>
             </w:r>
           </w:p>
         </w:tc>
@@ -18506,7 +18763,7 @@
                 <w:sz w:val="24"/>
                 <w:szCs w:val="24"/>
               </w:rPr>
-              <w:t>12.a.</w:t>
+              <w:t>12a</w:t>
             </w:r>
           </w:p>
         </w:tc>
@@ -18652,7 +18909,7 @@
                 <w:sz w:val="24"/>
                 <w:szCs w:val="24"/>
               </w:rPr>
-              <w:t>12.a.</w:t>
+              <w:t>12a</w:t>
             </w:r>
           </w:p>
         </w:tc>
@@ -18798,7 +19055,7 @@
                 <w:sz w:val="24"/>
                 <w:szCs w:val="24"/>
               </w:rPr>
-              <w:t>12.a.</w:t>
+              <w:t>12a</w:t>
             </w:r>
           </w:p>
         </w:tc>
@@ -18944,7 +19201,7 @@
                 <w:sz w:val="24"/>
                 <w:szCs w:val="24"/>
               </w:rPr>
-              <w:t>12.a.</w:t>
+              <w:t>12a</w:t>
             </w:r>
           </w:p>
         </w:tc>
@@ -19090,7 +19347,7 @@
                 <w:sz w:val="24"/>
                 <w:szCs w:val="24"/>
               </w:rPr>
-              <w:t>12.a.</w:t>
+              <w:t>12a</w:t>
             </w:r>
           </w:p>
         </w:tc>
@@ -19236,7 +19493,7 @@
                 <w:sz w:val="24"/>
                 <w:szCs w:val="24"/>
               </w:rPr>
-              <w:t>12.a.</w:t>
+              <w:t>12a</w:t>
             </w:r>
           </w:p>
         </w:tc>
@@ -19382,7 +19639,7 @@
                 <w:sz w:val="24"/>
                 <w:szCs w:val="24"/>
               </w:rPr>
-              <w:t>12.a.</w:t>
+              <w:t>12a</w:t>
             </w:r>
           </w:p>
         </w:tc>
@@ -19609,7 +19866,7 @@
                 <w:szCs w:val="24"/>
               </w:rPr>
               <w:lastRenderedPageBreak/>
-              <w:t>12.b.</w:t>
+              <w:t>12b</w:t>
             </w:r>
           </w:p>
         </w:tc>
@@ -19755,7 +20012,7 @@
                 <w:sz w:val="24"/>
                 <w:szCs w:val="24"/>
               </w:rPr>
-              <w:t>12.b.</w:t>
+              <w:t>12b</w:t>
             </w:r>
           </w:p>
         </w:tc>
@@ -19804,7 +20061,25 @@
                 <w:sz w:val="24"/>
                 <w:szCs w:val="24"/>
               </w:rPr>
-              <w:t>What is CSP? Explain CSP and constraint propagation with Node-coloring problem.</w:t>
+              <w:t>What is CSP? Explain CSP and constraint propagation with Node-</w:t>
+            </w:r>
+            <w:proofErr w:type="spellStart"/>
+            <w:r>
+              <w:rPr>
+                <w:rFonts w:ascii="Times New Roman" w:hAnsi="Times New Roman" w:cs="Times New Roman"/>
+                <w:sz w:val="24"/>
+                <w:szCs w:val="24"/>
+              </w:rPr>
+              <w:t>coloring</w:t>
+            </w:r>
+            <w:proofErr w:type="spellEnd"/>
+            <w:r>
+              <w:rPr>
+                <w:rFonts w:ascii="Times New Roman" w:hAnsi="Times New Roman" w:cs="Times New Roman"/>
+                <w:sz w:val="24"/>
+                <w:szCs w:val="24"/>
+              </w:rPr>
+              <w:t xml:space="preserve"> problem.</w:t>
             </w:r>
             <w:r>
               <w:rPr>
@@ -19902,7 +20177,7 @@
                 <w:sz w:val="24"/>
                 <w:szCs w:val="24"/>
               </w:rPr>
-              <w:t>12.b.</w:t>
+              <w:t>12b</w:t>
             </w:r>
           </w:p>
         </w:tc>
@@ -20048,7 +20323,7 @@
                 <w:sz w:val="24"/>
                 <w:szCs w:val="24"/>
               </w:rPr>
-              <w:t>12.b.</w:t>
+              <w:t>12b</w:t>
             </w:r>
           </w:p>
         </w:tc>
@@ -20194,7 +20469,7 @@
                 <w:sz w:val="24"/>
                 <w:szCs w:val="24"/>
               </w:rPr>
-              <w:t>12.b.</w:t>
+              <w:t>12b</w:t>
             </w:r>
           </w:p>
         </w:tc>
@@ -20243,7 +20518,25 @@
                 <w:sz w:val="24"/>
                 <w:szCs w:val="24"/>
               </w:rPr>
-              <w:t>What is CSP? Explain CSP and constraint propagation with Node-coloring problem.</w:t>
+              <w:t>What is CSP? Explain CSP and constraint propagation with Node-</w:t>
+            </w:r>
+            <w:proofErr w:type="spellStart"/>
+            <w:r>
+              <w:rPr>
+                <w:rFonts w:ascii="Times New Roman" w:hAnsi="Times New Roman" w:cs="Times New Roman"/>
+                <w:sz w:val="24"/>
+                <w:szCs w:val="24"/>
+              </w:rPr>
+              <w:t>coloring</w:t>
+            </w:r>
+            <w:proofErr w:type="spellEnd"/>
+            <w:r>
+              <w:rPr>
+                <w:rFonts w:ascii="Times New Roman" w:hAnsi="Times New Roman" w:cs="Times New Roman"/>
+                <w:sz w:val="24"/>
+                <w:szCs w:val="24"/>
+              </w:rPr>
+              <w:t xml:space="preserve"> problem.</w:t>
             </w:r>
             <w:r>
               <w:rPr>
@@ -20341,7 +20634,7 @@
                 <w:sz w:val="24"/>
                 <w:szCs w:val="24"/>
               </w:rPr>
-              <w:t>12.b.</w:t>
+              <w:t>12b</w:t>
             </w:r>
           </w:p>
         </w:tc>
@@ -20597,7 +20890,7 @@
                 <w:sz w:val="24"/>
                 <w:szCs w:val="24"/>
               </w:rPr>
-              <w:t>12.b.</w:t>
+              <w:t>12b</w:t>
             </w:r>
           </w:p>
         </w:tc>
@@ -20646,7 +20939,25 @@
                 <w:sz w:val="24"/>
                 <w:szCs w:val="24"/>
               </w:rPr>
-              <w:t>What is CSP? Explain CSP and constraint propagation with Node-coloring problem.</w:t>
+              <w:t>What is CSP? Explain CSP and constraint propagation with Node-</w:t>
+            </w:r>
+            <w:proofErr w:type="spellStart"/>
+            <w:r>
+              <w:rPr>
+                <w:rFonts w:ascii="Times New Roman" w:hAnsi="Times New Roman" w:cs="Times New Roman"/>
+                <w:sz w:val="24"/>
+                <w:szCs w:val="24"/>
+              </w:rPr>
+              <w:t>coloring</w:t>
+            </w:r>
+            <w:proofErr w:type="spellEnd"/>
+            <w:r>
+              <w:rPr>
+                <w:rFonts w:ascii="Times New Roman" w:hAnsi="Times New Roman" w:cs="Times New Roman"/>
+                <w:sz w:val="24"/>
+                <w:szCs w:val="24"/>
+              </w:rPr>
+              <w:t xml:space="preserve"> problem.</w:t>
             </w:r>
             <w:r>
               <w:rPr>
@@ -20744,7 +21055,7 @@
                 <w:sz w:val="24"/>
                 <w:szCs w:val="24"/>
               </w:rPr>
-              <w:t>12.b.</w:t>
+              <w:t>12b</w:t>
             </w:r>
           </w:p>
         </w:tc>
@@ -20890,7 +21201,7 @@
                 <w:sz w:val="24"/>
                 <w:szCs w:val="24"/>
               </w:rPr>
-              <w:t>12.b.</w:t>
+              <w:t>12b</w:t>
             </w:r>
           </w:p>
         </w:tc>
@@ -21036,7 +21347,7 @@
                 <w:sz w:val="24"/>
                 <w:szCs w:val="24"/>
               </w:rPr>
-              <w:t>13.a.</w:t>
+              <w:t>13a</w:t>
             </w:r>
           </w:p>
         </w:tc>
@@ -21158,7 +21469,7 @@
                 <w:sz w:val="24"/>
                 <w:szCs w:val="24"/>
               </w:rPr>
-              <w:t>13.a.</w:t>
+              <w:t>13a</w:t>
             </w:r>
           </w:p>
         </w:tc>
@@ -21278,7 +21589,7 @@
                 <w:sz w:val="24"/>
                 <w:szCs w:val="24"/>
               </w:rPr>
-              <w:t>13.a.</w:t>
+              <w:t>13a</w:t>
             </w:r>
           </w:p>
         </w:tc>
@@ -21450,7 +21761,7 @@
                 <w:sz w:val="24"/>
                 <w:szCs w:val="24"/>
               </w:rPr>
-              <w:t>13.a.</w:t>
+              <w:t>13a</w:t>
             </w:r>
           </w:p>
         </w:tc>
@@ -21587,7 +21898,7 @@
                 <w:sz w:val="24"/>
                 <w:szCs w:val="24"/>
               </w:rPr>
-              <w:t>13.a.</w:t>
+              <w:t>13a</w:t>
             </w:r>
           </w:p>
         </w:tc>
@@ -21724,7 +22035,7 @@
                 <w:sz w:val="24"/>
                 <w:szCs w:val="24"/>
               </w:rPr>
-              <w:t>13.a.</w:t>
+              <w:t>13a</w:t>
             </w:r>
           </w:p>
         </w:tc>
@@ -21864,7 +22175,7 @@
                 <w:sz w:val="24"/>
                 <w:szCs w:val="24"/>
               </w:rPr>
-              <w:t>13.a.</w:t>
+              <w:t>13a</w:t>
             </w:r>
           </w:p>
         </w:tc>
@@ -22001,7 +22312,7 @@
                 <w:sz w:val="24"/>
                 <w:szCs w:val="24"/>
               </w:rPr>
-              <w:t>13.a.</w:t>
+              <w:t>13a</w:t>
             </w:r>
           </w:p>
         </w:tc>
@@ -22139,7 +22450,7 @@
                 <w:szCs w:val="24"/>
               </w:rPr>
               <w:lastRenderedPageBreak/>
-              <w:t>13.a.</w:t>
+              <w:t>13a</w:t>
             </w:r>
           </w:p>
         </w:tc>
@@ -22306,7 +22617,7 @@
                 <w:sz w:val="24"/>
                 <w:szCs w:val="24"/>
               </w:rPr>
-              <w:t>13.a.</w:t>
+              <w:t>13a</w:t>
             </w:r>
           </w:p>
         </w:tc>
@@ -22456,7 +22767,7 @@
                 <w:sz w:val="24"/>
                 <w:szCs w:val="24"/>
               </w:rPr>
-              <w:t>13.b.</w:t>
+              <w:t>13b</w:t>
             </w:r>
           </w:p>
         </w:tc>
@@ -22604,7 +22915,7 @@
                 <w:sz w:val="24"/>
                 <w:szCs w:val="24"/>
               </w:rPr>
-              <w:t>13.b.</w:t>
+              <w:t>13b</w:t>
             </w:r>
           </w:p>
         </w:tc>
@@ -22752,7 +23063,7 @@
                 <w:sz w:val="24"/>
                 <w:szCs w:val="24"/>
               </w:rPr>
-              <w:t>13.b.</w:t>
+              <w:t>13b</w:t>
             </w:r>
           </w:p>
         </w:tc>
@@ -22887,7 +23198,7 @@
                 <w:sz w:val="24"/>
                 <w:szCs w:val="24"/>
               </w:rPr>
-              <w:t>13.b.</w:t>
+              <w:t>13b</w:t>
             </w:r>
           </w:p>
         </w:tc>
@@ -23223,7 +23534,7 @@
                 <w:sz w:val="24"/>
                 <w:szCs w:val="24"/>
               </w:rPr>
-              <w:t>13.b.</w:t>
+              <w:t>13b</w:t>
             </w:r>
           </w:p>
         </w:tc>
@@ -23545,7 +23856,7 @@
                 <w:sz w:val="24"/>
                 <w:szCs w:val="24"/>
               </w:rPr>
-              <w:t>13.b.</w:t>
+              <w:t>13b</w:t>
             </w:r>
           </w:p>
         </w:tc>
@@ -23664,7 +23975,7 @@
                 <w:sz w:val="24"/>
                 <w:szCs w:val="24"/>
               </w:rPr>
-              <w:t>13.b.</w:t>
+              <w:t>13b</w:t>
             </w:r>
           </w:p>
         </w:tc>
@@ -23809,7 +24120,7 @@
                 <w:sz w:val="24"/>
                 <w:szCs w:val="24"/>
               </w:rPr>
-              <w:t>13.b.</w:t>
+              <w:t>13b</w:t>
             </w:r>
           </w:p>
         </w:tc>
@@ -23954,7 +24265,7 @@
                 <w:sz w:val="24"/>
                 <w:szCs w:val="24"/>
               </w:rPr>
-              <w:t>13.b.</w:t>
+              <w:t>13b</w:t>
             </w:r>
           </w:p>
         </w:tc>
@@ -24099,7 +24410,7 @@
                 <w:sz w:val="24"/>
                 <w:szCs w:val="24"/>
               </w:rPr>
-              <w:t>13.b.</w:t>
+              <w:t>13b</w:t>
             </w:r>
           </w:p>
         </w:tc>
@@ -24228,7 +24539,7 @@
                 <w:szCs w:val="24"/>
               </w:rPr>
               <w:lastRenderedPageBreak/>
-              <w:t>14.a.</w:t>
+              <w:t>14a</w:t>
             </w:r>
           </w:p>
         </w:tc>
@@ -24360,7 +24671,7 @@
                 <w:sz w:val="24"/>
                 <w:szCs w:val="24"/>
               </w:rPr>
-              <w:t>14.a.</w:t>
+              <w:t>14a</w:t>
             </w:r>
           </w:p>
         </w:tc>
@@ -24489,7 +24800,7 @@
                 <w:sz w:val="24"/>
                 <w:szCs w:val="24"/>
               </w:rPr>
-              <w:t>14.a.</w:t>
+              <w:t>14a</w:t>
             </w:r>
           </w:p>
         </w:tc>
@@ -24618,7 +24929,7 @@
                 <w:sz w:val="24"/>
                 <w:szCs w:val="24"/>
               </w:rPr>
-              <w:t>14.a.</w:t>
+              <w:t>14a</w:t>
             </w:r>
           </w:p>
         </w:tc>
@@ -24747,7 +25058,7 @@
                 <w:sz w:val="24"/>
                 <w:szCs w:val="24"/>
               </w:rPr>
-              <w:t>14.a.</w:t>
+              <w:t>14a</w:t>
             </w:r>
           </w:p>
         </w:tc>
@@ -24868,7 +25179,7 @@
                 <w:sz w:val="24"/>
                 <w:szCs w:val="24"/>
               </w:rPr>
-              <w:t>14.a.</w:t>
+              <w:t>14a</w:t>
             </w:r>
           </w:p>
         </w:tc>
@@ -24997,7 +25308,7 @@
                 <w:sz w:val="24"/>
                 <w:szCs w:val="24"/>
               </w:rPr>
-              <w:t>14.a.</w:t>
+              <w:t>14a</w:t>
             </w:r>
           </w:p>
         </w:tc>
@@ -25126,7 +25437,7 @@
                 <w:sz w:val="24"/>
                 <w:szCs w:val="24"/>
               </w:rPr>
-              <w:t>14.a.</w:t>
+              <w:t>14a</w:t>
             </w:r>
           </w:p>
         </w:tc>
@@ -25255,7 +25566,15 @@
                 <w:sz w:val="24"/>
                 <w:szCs w:val="24"/>
               </w:rPr>
-              <w:t>14.a.</w:t>
+              <w:t>14</w:t>
+            </w:r>
+            <w:r>
+              <w:rPr>
+                <w:rFonts w:ascii="Times New Roman" w:hAnsi="Times New Roman" w:cs="Times New Roman"/>
+                <w:sz w:val="24"/>
+                <w:szCs w:val="24"/>
+              </w:rPr>
+              <w:t>a</w:t>
             </w:r>
           </w:p>
         </w:tc>
@@ -25384,7 +25703,7 @@
                 <w:sz w:val="24"/>
                 <w:szCs w:val="24"/>
               </w:rPr>
-              <w:t>14.a.</w:t>
+              <w:t>14a</w:t>
             </w:r>
           </w:p>
         </w:tc>
@@ -25513,7 +25832,7 @@
                 <w:sz w:val="24"/>
                 <w:szCs w:val="24"/>
               </w:rPr>
-              <w:t>14.b.</w:t>
+              <w:t>14b</w:t>
             </w:r>
           </w:p>
         </w:tc>
@@ -25642,7 +25961,7 @@
                 <w:sz w:val="24"/>
                 <w:szCs w:val="24"/>
               </w:rPr>
-              <w:t>14.b.</w:t>
+              <w:t>14b</w:t>
             </w:r>
           </w:p>
         </w:tc>
@@ -25771,7 +26090,7 @@
                 <w:sz w:val="24"/>
                 <w:szCs w:val="24"/>
               </w:rPr>
-              <w:t>14.b.</w:t>
+              <w:t>14b</w:t>
             </w:r>
           </w:p>
         </w:tc>
@@ -25900,7 +26219,15 @@
                 <w:sz w:val="24"/>
                 <w:szCs w:val="24"/>
               </w:rPr>
-              <w:t>14.b.</w:t>
+              <w:t>14</w:t>
+            </w:r>
+            <w:r>
+              <w:rPr>
+                <w:rFonts w:ascii="Times New Roman" w:hAnsi="Times New Roman" w:cs="Times New Roman"/>
+                <w:sz w:val="24"/>
+                <w:szCs w:val="24"/>
+              </w:rPr>
+              <w:t>b</w:t>
             </w:r>
           </w:p>
         </w:tc>
@@ -26029,7 +26356,15 @@
                 <w:sz w:val="24"/>
                 <w:szCs w:val="24"/>
               </w:rPr>
-              <w:t>14.b.</w:t>
+              <w:t>14</w:t>
+            </w:r>
+            <w:r>
+              <w:rPr>
+                <w:rFonts w:ascii="Times New Roman" w:hAnsi="Times New Roman" w:cs="Times New Roman"/>
+                <w:sz w:val="24"/>
+                <w:szCs w:val="24"/>
+              </w:rPr>
+              <w:t>b</w:t>
             </w:r>
           </w:p>
         </w:tc>
@@ -26050,15 +26385,6 @@
                 <w:szCs w:val="24"/>
               </w:rPr>
             </w:pPr>
-            <w:r>
-              <w:rPr>
-                <w:rFonts w:ascii="Times New Roman" w:hAnsi="Times New Roman" w:cs="Times New Roman"/>
-                <w:color w:val="000000" w:themeColor="text1"/>
-                <w:sz w:val="24"/>
-                <w:szCs w:val="24"/>
-              </w:rPr>
-              <w:t>5</w:t>
-            </w:r>
           </w:p>
         </w:tc>
         <w:tc>
@@ -26158,7 +26484,7 @@
                 <w:sz w:val="24"/>
                 <w:szCs w:val="24"/>
               </w:rPr>
-              <w:t>14.b.</w:t>
+              <w:t>14b</w:t>
             </w:r>
           </w:p>
         </w:tc>
@@ -26287,7 +26613,7 @@
                 <w:sz w:val="24"/>
                 <w:szCs w:val="24"/>
               </w:rPr>
-              <w:t>14.b.</w:t>
+              <w:t>14b</w:t>
             </w:r>
           </w:p>
         </w:tc>
@@ -26416,7 +26742,7 @@
                 <w:sz w:val="24"/>
                 <w:szCs w:val="24"/>
               </w:rPr>
-              <w:t>14.b.</w:t>
+              <w:t>14b</w:t>
             </w:r>
           </w:p>
         </w:tc>
@@ -26545,7 +26871,7 @@
                 <w:sz w:val="24"/>
                 <w:szCs w:val="24"/>
               </w:rPr>
-              <w:t>14.b.</w:t>
+              <w:t>14b</w:t>
             </w:r>
           </w:p>
         </w:tc>
@@ -26674,7 +27000,7 @@
                 <w:sz w:val="24"/>
                 <w:szCs w:val="24"/>
               </w:rPr>
-              <w:t>14.b.</w:t>
+              <w:t>14b</w:t>
             </w:r>
           </w:p>
         </w:tc>
@@ -26803,7 +27129,7 @@
                 <w:sz w:val="24"/>
                 <w:szCs w:val="24"/>
               </w:rPr>
-              <w:t>15.a.</w:t>
+              <w:t>15a</w:t>
             </w:r>
           </w:p>
         </w:tc>
@@ -26925,7 +27251,7 @@
                 <w:sz w:val="24"/>
                 <w:szCs w:val="24"/>
               </w:rPr>
-              <w:t>15.a.</w:t>
+              <w:t>15a</w:t>
             </w:r>
           </w:p>
         </w:tc>
@@ -27048,7 +27374,7 @@
                 <w:szCs w:val="24"/>
               </w:rPr>
               <w:lastRenderedPageBreak/>
-              <w:t>15.a.</w:t>
+              <w:t>15a</w:t>
             </w:r>
           </w:p>
         </w:tc>
@@ -27168,7 +27494,7 @@
                 <w:sz w:val="24"/>
                 <w:szCs w:val="24"/>
               </w:rPr>
-              <w:t>15.a.</w:t>
+              <w:t>15a</w:t>
             </w:r>
           </w:p>
         </w:tc>
@@ -27288,7 +27614,7 @@
                 <w:sz w:val="24"/>
                 <w:szCs w:val="24"/>
               </w:rPr>
-              <w:t>15.a.</w:t>
+              <w:t>15a</w:t>
             </w:r>
           </w:p>
         </w:tc>
@@ -27408,7 +27734,7 @@
                 <w:sz w:val="24"/>
                 <w:szCs w:val="24"/>
               </w:rPr>
-              <w:t>15.a.</w:t>
+              <w:t>15a</w:t>
             </w:r>
           </w:p>
         </w:tc>
@@ -27528,7 +27854,7 @@
                 <w:sz w:val="24"/>
                 <w:szCs w:val="24"/>
               </w:rPr>
-              <w:t>15.a.</w:t>
+              <w:t>15a</w:t>
             </w:r>
           </w:p>
         </w:tc>
@@ -27648,7 +27974,7 @@
                 <w:sz w:val="24"/>
                 <w:szCs w:val="24"/>
               </w:rPr>
-              <w:t>15.a.</w:t>
+              <w:t>15a</w:t>
             </w:r>
           </w:p>
         </w:tc>
@@ -27768,7 +28094,7 @@
                 <w:sz w:val="24"/>
                 <w:szCs w:val="24"/>
               </w:rPr>
-              <w:t>15.a.</w:t>
+              <w:t>15a</w:t>
             </w:r>
           </w:p>
         </w:tc>
@@ -27888,7 +28214,7 @@
                 <w:sz w:val="24"/>
                 <w:szCs w:val="24"/>
               </w:rPr>
-              <w:t>15.a.</w:t>
+              <w:t>15a</w:t>
             </w:r>
           </w:p>
         </w:tc>
@@ -28008,7 +28334,7 @@
                 <w:sz w:val="24"/>
                 <w:szCs w:val="24"/>
               </w:rPr>
-              <w:t>15.b.</w:t>
+              <w:t>15b</w:t>
             </w:r>
           </w:p>
         </w:tc>
@@ -28059,7 +28385,25 @@
                 <w:sz w:val="24"/>
                 <w:szCs w:val="24"/>
               </w:rPr>
-              <w:t>Define Expert System. Illustrate the architecture of Expert system and Explain the components and Elements of Expert system with its respective flow diagrams. (13)</w:t>
+              <w:t xml:space="preserve">Define Expert System. Illustrate the architecture of Expert system and </w:t>
+            </w:r>
+            <w:proofErr w:type="gramStart"/>
+            <w:r>
+              <w:rPr>
+                <w:rFonts w:ascii="Times New Roman" w:hAnsi="Times New Roman" w:cs="Times New Roman"/>
+                <w:sz w:val="24"/>
+                <w:szCs w:val="24"/>
+              </w:rPr>
+              <w:t>Explain</w:t>
+            </w:r>
+            <w:proofErr w:type="gramEnd"/>
+            <w:r>
+              <w:rPr>
+                <w:rFonts w:ascii="Times New Roman" w:hAnsi="Times New Roman" w:cs="Times New Roman"/>
+                <w:sz w:val="24"/>
+                <w:szCs w:val="24"/>
+              </w:rPr>
+              <w:t xml:space="preserve"> the components and Elements of Expert system with its respective flow diagrams. (13)</w:t>
             </w:r>
           </w:p>
         </w:tc>
@@ -28130,7 +28474,7 @@
                 <w:sz w:val="24"/>
                 <w:szCs w:val="24"/>
               </w:rPr>
-              <w:t>15.b.</w:t>
+              <w:t>15b</w:t>
             </w:r>
           </w:p>
         </w:tc>
@@ -28181,7 +28525,25 @@
                 <w:sz w:val="24"/>
                 <w:szCs w:val="24"/>
               </w:rPr>
-              <w:t>What is an Expert System? Draw the architecture of Expert system and Describe the components and Elements of Expert system with its respective flow diagrams. (13)</w:t>
+              <w:t xml:space="preserve">What is an Expert System? Draw the architecture of Expert system and </w:t>
+            </w:r>
+            <w:proofErr w:type="gramStart"/>
+            <w:r>
+              <w:rPr>
+                <w:rFonts w:ascii="Times New Roman" w:hAnsi="Times New Roman" w:cs="Times New Roman"/>
+                <w:sz w:val="24"/>
+                <w:szCs w:val="24"/>
+              </w:rPr>
+              <w:t>Describe</w:t>
+            </w:r>
+            <w:proofErr w:type="gramEnd"/>
+            <w:r>
+              <w:rPr>
+                <w:rFonts w:ascii="Times New Roman" w:hAnsi="Times New Roman" w:cs="Times New Roman"/>
+                <w:sz w:val="24"/>
+                <w:szCs w:val="24"/>
+              </w:rPr>
+              <w:t xml:space="preserve"> the components and Elements of Expert system with its respective flow diagrams. (13)</w:t>
             </w:r>
           </w:p>
         </w:tc>
@@ -28252,7 +28614,7 @@
                 <w:sz w:val="24"/>
                 <w:szCs w:val="24"/>
               </w:rPr>
-              <w:t>15.b.</w:t>
+              <w:t>15b</w:t>
             </w:r>
           </w:p>
         </w:tc>
@@ -28303,7 +28665,25 @@
                 <w:sz w:val="24"/>
                 <w:szCs w:val="24"/>
               </w:rPr>
-              <w:t>Represent the architecture of Expert system and Explain the components and Elements of Expert system with its respective flow diagrams. (13)</w:t>
+              <w:t xml:space="preserve">Represent the architecture of Expert system and </w:t>
+            </w:r>
+            <w:proofErr w:type="gramStart"/>
+            <w:r>
+              <w:rPr>
+                <w:rFonts w:ascii="Times New Roman" w:hAnsi="Times New Roman" w:cs="Times New Roman"/>
+                <w:sz w:val="24"/>
+                <w:szCs w:val="24"/>
+              </w:rPr>
+              <w:t>Explain</w:t>
+            </w:r>
+            <w:proofErr w:type="gramEnd"/>
+            <w:r>
+              <w:rPr>
+                <w:rFonts w:ascii="Times New Roman" w:hAnsi="Times New Roman" w:cs="Times New Roman"/>
+                <w:sz w:val="24"/>
+                <w:szCs w:val="24"/>
+              </w:rPr>
+              <w:t xml:space="preserve"> the components and Elements of Expert system with its respective flow diagrams. (13)</w:t>
             </w:r>
           </w:p>
         </w:tc>
@@ -28374,7 +28754,7 @@
                 <w:sz w:val="24"/>
                 <w:szCs w:val="24"/>
               </w:rPr>
-              <w:t>15.b.</w:t>
+              <w:t>15b</w:t>
             </w:r>
           </w:p>
         </w:tc>
@@ -28496,7 +28876,7 @@
                 <w:sz w:val="24"/>
                 <w:szCs w:val="24"/>
               </w:rPr>
-              <w:t>15.b.</w:t>
+              <w:t>15b</w:t>
             </w:r>
           </w:p>
         </w:tc>
@@ -28547,7 +28927,25 @@
                 <w:sz w:val="24"/>
                 <w:szCs w:val="24"/>
               </w:rPr>
-              <w:t>Illustrate the architecture of Expert system and Explain the components and Elements of Expert system with its respective flow diagrams. (13)</w:t>
+              <w:t xml:space="preserve">Illustrate the architecture of Expert system and </w:t>
+            </w:r>
+            <w:proofErr w:type="gramStart"/>
+            <w:r>
+              <w:rPr>
+                <w:rFonts w:ascii="Times New Roman" w:hAnsi="Times New Roman" w:cs="Times New Roman"/>
+                <w:sz w:val="24"/>
+                <w:szCs w:val="24"/>
+              </w:rPr>
+              <w:t>Explain</w:t>
+            </w:r>
+            <w:proofErr w:type="gramEnd"/>
+            <w:r>
+              <w:rPr>
+                <w:rFonts w:ascii="Times New Roman" w:hAnsi="Times New Roman" w:cs="Times New Roman"/>
+                <w:sz w:val="24"/>
+                <w:szCs w:val="24"/>
+              </w:rPr>
+              <w:t xml:space="preserve"> the components and Elements of Expert system with its respective flow diagrams. (13)</w:t>
             </w:r>
           </w:p>
         </w:tc>
@@ -28618,7 +29016,7 @@
                 <w:sz w:val="24"/>
                 <w:szCs w:val="24"/>
               </w:rPr>
-              <w:t>15.b.</w:t>
+              <w:t>15b</w:t>
             </w:r>
           </w:p>
         </w:tc>
@@ -28740,7 +29138,7 @@
                 <w:sz w:val="24"/>
                 <w:szCs w:val="24"/>
               </w:rPr>
-              <w:t>15.b.</w:t>
+              <w:t>15b</w:t>
             </w:r>
           </w:p>
         </w:tc>
@@ -28862,7 +29260,7 @@
                 <w:sz w:val="24"/>
                 <w:szCs w:val="24"/>
               </w:rPr>
-              <w:t>15.b.</w:t>
+              <w:t>15b</w:t>
             </w:r>
           </w:p>
         </w:tc>
@@ -28913,7 +29311,25 @@
                 <w:sz w:val="24"/>
                 <w:szCs w:val="24"/>
               </w:rPr>
-              <w:t>Draw the architecture of Expert system and Explain the components and Elements of Expert system with its respective flow diagrams. (13)</w:t>
+              <w:t xml:space="preserve">Draw the architecture of Expert system and </w:t>
+            </w:r>
+            <w:proofErr w:type="gramStart"/>
+            <w:r>
+              <w:rPr>
+                <w:rFonts w:ascii="Times New Roman" w:hAnsi="Times New Roman" w:cs="Times New Roman"/>
+                <w:sz w:val="24"/>
+                <w:szCs w:val="24"/>
+              </w:rPr>
+              <w:t>Explain</w:t>
+            </w:r>
+            <w:proofErr w:type="gramEnd"/>
+            <w:r>
+              <w:rPr>
+                <w:rFonts w:ascii="Times New Roman" w:hAnsi="Times New Roman" w:cs="Times New Roman"/>
+                <w:sz w:val="24"/>
+                <w:szCs w:val="24"/>
+              </w:rPr>
+              <w:t xml:space="preserve"> the components and Elements of Expert system with its respective flow diagrams. (13)</w:t>
             </w:r>
           </w:p>
         </w:tc>
@@ -28984,7 +29400,7 @@
                 <w:sz w:val="24"/>
                 <w:szCs w:val="24"/>
               </w:rPr>
-              <w:t>15.b.</w:t>
+              <w:t>15b</w:t>
             </w:r>
           </w:p>
         </w:tc>
@@ -29106,7 +29522,7 @@
                 <w:sz w:val="24"/>
                 <w:szCs w:val="24"/>
               </w:rPr>
-              <w:t>15.b.</w:t>
+              <w:t>15b</w:t>
             </w:r>
           </w:p>
         </w:tc>
@@ -29157,7 +29573,25 @@
                 <w:sz w:val="24"/>
                 <w:szCs w:val="24"/>
               </w:rPr>
-              <w:t>Illustrate the architecture of Expert system and Explain the components and Elements of Expert system with its respective flow diagrams. (13)</w:t>
+              <w:t xml:space="preserve">Illustrate the architecture of Expert system and </w:t>
+            </w:r>
+            <w:proofErr w:type="gramStart"/>
+            <w:r>
+              <w:rPr>
+                <w:rFonts w:ascii="Times New Roman" w:hAnsi="Times New Roman" w:cs="Times New Roman"/>
+                <w:sz w:val="24"/>
+                <w:szCs w:val="24"/>
+              </w:rPr>
+              <w:t>Explain</w:t>
+            </w:r>
+            <w:proofErr w:type="gramEnd"/>
+            <w:r>
+              <w:rPr>
+                <w:rFonts w:ascii="Times New Roman" w:hAnsi="Times New Roman" w:cs="Times New Roman"/>
+                <w:sz w:val="24"/>
+                <w:szCs w:val="24"/>
+              </w:rPr>
+              <w:t xml:space="preserve"> the components and Elements of Expert system with its respective flow diagrams. (13)</w:t>
             </w:r>
           </w:p>
         </w:tc>

</xml_diff>